<commit_message>
documentación restante de Evidencias Metodológicas
</commit_message>
<xml_diff>
--- a/FASE 2/Evidencias Individuales/VILCHES_PAOLO_2.1_APT122_DiarioReflexionFase2.docx
+++ b/FASE 2/Evidencias Individuales/VILCHES_PAOLO_2.1_APT122_DiarioReflexionFase2.docx
@@ -70,12 +70,12 @@
                 <wp:inline distB="0" distT="0" distL="0" distR="0">
                   <wp:extent cx="393640" cy="444500"/>
                   <wp:effectExtent b="0" l="0" r="0" t="0"/>
-                  <wp:docPr id="17580" name="image4.png"/>
+                  <wp:docPr id="17580" name="image5.png"/>
                   <a:graphic>
                     <a:graphicData uri="http://schemas.openxmlformats.org/drawingml/2006/picture">
                       <pic:pic>
                         <pic:nvPicPr>
-                          <pic:cNvPr id="0" name="image4.png"/>
+                          <pic:cNvPr id="0" name="image5.png"/>
                           <pic:cNvPicPr preferRelativeResize="0"/>
                         </pic:nvPicPr>
                         <pic:blipFill>
@@ -206,23 +206,6 @@
         </w:tc>
       </w:tr>
     </w:tbl>
-    <w:p>
-      <w:pPr>
-        <w:spacing w:after="0" w:line="360" w:lineRule="auto"/>
-        <w:jc w:val="both"/>
-        <w:rPr>
-          <w:b w:val="1"/>
-          <w:bCs w:val="1"/>
-          <w:sz w:val="24"/>
-          <w:szCs w:val="24"/>
-        </w:rPr>
-      </w:pPr>
-      <w:r>
-        <w:rPr>
-          <w:rtl w:val="0"/>
-        </w:rPr>
-      </w:r>
-    </w:p>
     <w:p>
       <w:pPr>
         <w:spacing w:after="0" w:line="360" w:lineRule="auto"/>
@@ -1472,12 +1455,12 @@
               <wp:extent cx="7753350" cy="190500"/>
               <wp:effectExtent b="0" l="0" r="0" t="0"/>
               <wp:wrapNone/>
-              <wp:docPr id="17579" name="image5.png"/>
+              <wp:docPr id="17579" name="image4.png"/>
               <a:graphic>
                 <a:graphicData uri="http://schemas.openxmlformats.org/drawingml/2006/picture">
                   <pic:pic>
                     <pic:nvPicPr>
-                      <pic:cNvPr id="0" name="image5.png"/>
+                      <pic:cNvPr id="0" name="image4.png"/>
                       <pic:cNvPicPr preferRelativeResize="0"/>
                     </pic:nvPicPr>
                     <pic:blipFill>
@@ -1669,12 +1652,12 @@
               <wp:inline distB="0" distT="0" distL="0" distR="0">
                 <wp:extent cx="1996440" cy="428625"/>
                 <wp:effectExtent b="0" l="0" r="0" t="0"/>
-                <wp:docPr descr="http://www.duoc.cl/normasgraficas/normasgraficas/marca-duoc/6logo-fondo-transparente/fondo-transparente.png" id="17582" name="image2.png"/>
+                <wp:docPr descr="http://www.duoc.cl/normasgraficas/normasgraficas/marca-duoc/6logo-fondo-transparente/fondo-transparente.png" id="17582" name="image1.png"/>
                 <a:graphic>
                   <a:graphicData uri="http://schemas.openxmlformats.org/drawingml/2006/picture">
                     <pic:pic>
                       <pic:nvPicPr>
-                        <pic:cNvPr descr="http://www.duoc.cl/normasgraficas/normasgraficas/marca-duoc/6logo-fondo-transparente/fondo-transparente.png" id="0" name="image2.png"/>
+                        <pic:cNvPr descr="http://www.duoc.cl/normasgraficas/normasgraficas/marca-duoc/6logo-fondo-transparente/fondo-transparente.png" id="0" name="image1.png"/>
                         <pic:cNvPicPr preferRelativeResize="0"/>
                       </pic:nvPicPr>
                       <pic:blipFill>
@@ -1860,12 +1843,12 @@
               <wp:inline distB="0" distT="0" distL="0" distR="0">
                 <wp:extent cx="361950" cy="581025"/>
                 <wp:effectExtent b="0" l="0" r="0" t="0"/>
-                <wp:docPr id="17581" name="image1.png"/>
+                <wp:docPr id="17581" name="image3.png"/>
                 <a:graphic>
                   <a:graphicData uri="http://schemas.openxmlformats.org/drawingml/2006/picture">
                     <pic:pic>
                       <pic:nvPicPr>
-                        <pic:cNvPr id="0" name="image1.png"/>
+                        <pic:cNvPr id="0" name="image3.png"/>
                         <pic:cNvPicPr preferRelativeResize="0"/>
                       </pic:nvPicPr>
                       <pic:blipFill>
@@ -2016,12 +1999,12 @@
               <wp:inline distB="0" distT="0" distL="0" distR="0">
                 <wp:extent cx="1895475" cy="466725"/>
                 <wp:effectExtent b="0" l="0" r="0" t="0"/>
-                <wp:docPr id="17583" name="image3.png"/>
+                <wp:docPr id="17583" name="image2.png"/>
                 <a:graphic>
                   <a:graphicData uri="http://schemas.openxmlformats.org/drawingml/2006/picture">
                     <pic:pic>
                       <pic:nvPicPr>
-                        <pic:cNvPr id="0" name="image3.png"/>
+                        <pic:cNvPr id="0" name="image2.png"/>
                         <pic:cNvPicPr preferRelativeResize="0"/>
                       </pic:nvPicPr>
                       <pic:blipFill>

</xml_diff>